<commit_message>
May: correção de refs
</commit_message>
<xml_diff>
--- a/docs/index - Copia.docx
+++ b/docs/index - Copia.docx
@@ -615,7 +615,7 @@
         <w:t xml:space="preserve">et al.</w:t>
       </w:r>
       <w:r>
-        <w:t xml:space="preserve">, 2025; SILVA, R. S.</w:t>
+        <w:t xml:space="preserve">, 2025; SILVA</w:t>
       </w:r>
       <w:r>
         <w:t xml:space="preserve"> </w:t>
@@ -715,7 +715,7 @@
         <w:t xml:space="preserve">et al.</w:t>
       </w:r>
       <w:r>
-        <w:t xml:space="preserve">, 2026; SILVA, D. M. A.; TERESA, R., 2017)</w:t>
+        <w:t xml:space="preserve">, 2026; SILVA, D. M. A. Da; TERESA, 2017)</w:t>
       </w:r>
       <w:r>
         <w:t xml:space="preserve">. Dessa forma, a sazonalidade pode alterar simultaneamente as condições ambientais e a estrutura do habitat, influenciando a organização das comunidades aquáticas.</w:t>
@@ -5009,13 +5009,26 @@
       </w:r>
     </w:p>
     <w:bookmarkEnd w:id="169"/>
-    <w:bookmarkStart w:id="171" w:name="ref-silva2017"/>
+    <w:bookmarkStart w:id="171" w:name="ref-silva2024"/>
     <w:p>
       <w:pPr>
         <w:pStyle w:val="Bibliography"/>
       </w:pPr>
       <w:r>
-        <w:t xml:space="preserve">SILVA, D. M. A.; TERESA, R. Response of fish communities to intense drought in brazilian savanna streams.</w:t>
+        <w:t xml:space="preserve">SILVA</w:t>
+      </w:r>
+      <w:r>
+        <w:t xml:space="preserve"> </w:t>
+      </w:r>
+      <w:r>
+        <w:rPr>
+          <w:i/>
+          <w:iCs/>
+        </w:rPr>
+        <w:t xml:space="preserve">et al.</w:t>
+      </w:r>
+      <w:r>
+        <w:t xml:space="preserve"> Daily cycle and environmental factors influence fish assemblage structure in an amazonian conservation unit.</w:t>
       </w:r>
       <w:r>
         <w:t xml:space="preserve"> </w:t>
@@ -5025,59 +5038,12 @@
           <w:b/>
           <w:bCs/>
         </w:rPr>
-        <w:t xml:space="preserve">Ambiente e Agua - An Interdisciplinary Journal of Applied Science</w:t>
-      </w:r>
-      <w:r>
-        <w:t xml:space="preserve">, 28 Jun. 2017. v. 12, n. 4, p. 618. Disponível em: &lt;</w:t>
+        <w:t xml:space="preserve">Brazilian Journal of Biology</w:t>
+      </w:r>
+      <w:r>
+        <w:t xml:space="preserve">, 2024. v. 84, p. e279923. Disponível em: &lt;</w:t>
       </w:r>
       <w:hyperlink r:id="rId170">
-        <w:r>
-          <w:rPr>
-            <w:rStyle w:val="Hyperlink"/>
-          </w:rPr>
-          <w:t xml:space="preserve">http://www.scielo.br/scielo.php?script=sci_arttext&amp;pid=S1980-993X2017000400618&amp;lng=en&amp;nrm=iso&amp;tlng=en</w:t>
-        </w:r>
-      </w:hyperlink>
-      <w:r>
-        <w:t xml:space="preserve">&gt;.</w:t>
-      </w:r>
-    </w:p>
-    <w:bookmarkEnd w:id="171"/>
-    <w:bookmarkStart w:id="173" w:name="ref-silva2024"/>
-    <w:p>
-      <w:pPr>
-        <w:pStyle w:val="Bibliography"/>
-      </w:pPr>
-      <w:r>
-        <w:t xml:space="preserve">SILVA, R. S.</w:t>
-      </w:r>
-      <w:r>
-        <w:t xml:space="preserve"> </w:t>
-      </w:r>
-      <w:r>
-        <w:rPr>
-          <w:i/>
-          <w:iCs/>
-        </w:rPr>
-        <w:t xml:space="preserve">et al.</w:t>
-      </w:r>
-      <w:r>
-        <w:t xml:space="preserve"> Daily cycle and environmental factors influence fish assemblage structure in an amazonian conservation unit.</w:t>
-      </w:r>
-      <w:r>
-        <w:t xml:space="preserve"> </w:t>
-      </w:r>
-      <w:r>
-        <w:rPr>
-          <w:b/>
-          <w:bCs/>
-        </w:rPr>
-        <w:t xml:space="preserve">Brazilian Journal of Biology</w:t>
-      </w:r>
-      <w:r>
-        <w:t xml:space="preserve">, 2024. v. 84, p. e279923. Disponível em: &lt;</w:t>
-      </w:r>
-      <w:hyperlink r:id="rId172">
         <w:r>
           <w:rPr>
             <w:rStyle w:val="Hyperlink"/>
@@ -5087,6 +5053,43 @@
       </w:hyperlink>
       <w:r>
         <w:t xml:space="preserve">&gt;.</w:t>
+      </w:r>
+    </w:p>
+    <w:bookmarkEnd w:id="171"/>
+    <w:bookmarkStart w:id="173" w:name="ref-silva2017"/>
+    <w:p>
+      <w:pPr>
+        <w:pStyle w:val="Bibliography"/>
+      </w:pPr>
+      <w:r>
+        <w:t xml:space="preserve">SILVA, D. M. A. Da; TERESA, F. B.</w:t>
+      </w:r>
+      <w:r>
+        <w:t xml:space="preserve"> </w:t>
+      </w:r>
+      <w:hyperlink r:id="rId172">
+        <w:r>
+          <w:rPr>
+            <w:rStyle w:val="Hyperlink"/>
+          </w:rPr>
+          <w:t xml:space="preserve">Response of fish communities to intense drought in brazilian savanna streams</w:t>
+        </w:r>
+      </w:hyperlink>
+      <w:r>
+        <w:t xml:space="preserve">.</w:t>
+      </w:r>
+      <w:r>
+        <w:t xml:space="preserve"> </w:t>
+      </w:r>
+      <w:r>
+        <w:rPr>
+          <w:b/>
+          <w:bCs/>
+        </w:rPr>
+        <w:t xml:space="preserve">Ambiente e Agua - An Interdisciplinary Journal of Applied Science</w:t>
+      </w:r>
+      <w:r>
+        <w:t xml:space="preserve">, 2017. v. 12, n. 4, p. 618.</w:t>
       </w:r>
     </w:p>
     <w:bookmarkEnd w:id="173"/>

</xml_diff>